<commit_message>
Give the D3 report the same layout as the D1 and D2 reports
- Cover: the D2 cover block (IT402 — DELIVERABLE 3 heading and the
  Field/Details table with student name and ID, course, version,
  sections, appendix, accompanying files and prior deliverables).
- Footer names the deliverable: "RentalPro — IT402 Deliverable 3 —
  Final Capstone Project Report".
- IT401 Deliverable 3 is called "Partially-Developed Application", its
  official name in D1 and D2.
- Body text justified at 1.15 line spacing, level-2 headings in navy
  and 9 pt table text, as in D2. TOC page numbers re-synced.

Co-Authored-By: Claude Opus 5.5 <noreply@anthropic.com>
Claude-Session: https://claude.ai/code/session_01RWFMfduqKT5hKY4Mtmzbq2
</commit_message>
<xml_diff>
--- a/docs/ABDURRAHMAAN_IT402_DEL_3_FINAL_REPORT.docx
+++ b/docs/ABDURRAHMAAN_IT402_DEL_3_FINAL_REPORT.docx
@@ -4,7 +4,7 @@
   <w:body>
     <w:p>
       <w:pPr>
-        <w:spacing w:before="2400"/>
+        <w:spacing w:before="1600"/>
       </w:pPr>
     </w:p>
     <w:p>
@@ -24,37 +24,37 @@
     </w:p>
     <w:p>
       <w:pPr>
-        <w:spacing w:before="200"/>
+        <w:spacing w:after="400"/>
         <w:jc w:val="center"/>
       </w:pPr>
       <w:r>
         <w:rPr>
+          <w:color w:val="475569"/>
+          <w:sz w:val="30"/>
+          <w:szCs w:val="30"/>
+        </w:rPr>
+        <w:t xml:space="preserve">Digital Rental Management System</w:t>
+      </w:r>
+    </w:p>
+    <w:p>
+      <w:pPr>
+        <w:spacing w:after="100" w:before="600"/>
+        <w:jc w:val="center"/>
+      </w:pPr>
+      <w:r>
+        <w:rPr>
+          <w:b/>
+          <w:bCs/>
           <w:color w:val="2563EB"/>
           <w:sz w:val="32"/>
           <w:szCs w:val="32"/>
         </w:rPr>
-        <w:t xml:space="preserve">Digital Rental Management System</w:t>
-      </w:r>
-    </w:p>
-    <w:p>
-      <w:pPr>
-        <w:spacing w:before="600"/>
-        <w:jc w:val="center"/>
-      </w:pPr>
-      <w:r>
-        <w:rPr>
-          <w:b/>
-          <w:bCs/>
-          <w:color w:val="0F172A"/>
-          <w:sz w:val="36"/>
-          <w:szCs w:val="36"/>
-        </w:rPr>
-        <w:t xml:space="preserve">Final Capstone Project Report</w:t>
-      </w:r>
-    </w:p>
-    <w:p>
-      <w:pPr>
-        <w:spacing w:before="300"/>
+        <w:t>IT402 — DELIVERABLE 3</w:t>
+      </w:r>
+    </w:p>
+    <w:p>
+      <w:pPr>
+        <w:spacing w:after="800"/>
         <w:jc w:val="center"/>
       </w:pPr>
       <w:r>
@@ -63,67 +63,628 @@
           <w:sz w:val="24"/>
           <w:szCs w:val="24"/>
         </w:rPr>
-        <w:t xml:space="preserve">IT402 — IT Capstone II</w:t>
-      </w:r>
-    </w:p>
-    <w:p>
-      <w:pPr>
-        <w:spacing w:before="100"/>
-        <w:jc w:val="center"/>
-      </w:pPr>
-      <w:r>
-        <w:rPr>
-          <w:i/>
-          <w:iCs/>
-          <w:color w:val="475569"/>
-          <w:sz w:val="21"/>
-          <w:szCs w:val="21"/>
-        </w:rPr>
-        <w:t xml:space="preserve">IT402 Deliverable 3 — Project Demo, Presentation, and Final Report</w:t>
-      </w:r>
-    </w:p>
-    <w:p>
-      <w:pPr>
-        <w:spacing w:before="1800"/>
-        <w:jc w:val="center"/>
-      </w:pPr>
-      <w:r>
-        <w:rPr>
-          <w:color w:val="0F172A"/>
-          <w:sz w:val="22"/>
-          <w:szCs w:val="22"/>
-        </w:rPr>
-        <w:t>Prepared by: Abdur-Rahmaan Muhammad Ali (Student ID ST10201821)</w:t>
-      </w:r>
-    </w:p>
-    <w:p>
-      <w:pPr>
-        <w:spacing w:before="100"/>
-        <w:jc w:val="center"/>
-      </w:pPr>
-      <w:r>
-        <w:rPr>
-          <w:color w:val="475569"/>
-          <w:sz w:val="18"/>
-          <w:szCs w:val="18"/>
-        </w:rPr>
-        <w:t xml:space="preserve">Submitted in fulfillment of the IT402 IT Capstone II requirements</w:t>
-      </w:r>
-    </w:p>
-    <w:p>
-      <w:pPr>
-        <w:spacing w:before="100"/>
-        <w:jc w:val="center"/>
-      </w:pPr>
-      <w:r>
-        <w:rPr>
-          <w:color w:val="475569"/>
-          <w:sz w:val="18"/>
-          <w:szCs w:val="18"/>
-        </w:rPr>
-        <w:t>v1.0 — October 2026</w:t>
-      </w:r>
-    </w:p>
+        <w:t>Final Capstone Project Report</w:t>
+      </w:r>
+    </w:p>
+    <w:p>
+      <w:pPr>
+        <w:spacing w:before="1000"/>
+      </w:pPr>
+    </w:p>
+    <w:tbl>
+      <w:tblPr>
+        <w:tblW w:type="dxa" w:w="9360"/>
+        <w:tblBorders>
+          <w:top w:val="single" w:color="CBD5E1" w:sz="2"/>
+          <w:left w:val="single" w:color="CBD5E1" w:sz="2"/>
+          <w:bottom w:val="single" w:color="CBD5E1" w:sz="2"/>
+          <w:right w:val="single" w:color="CBD5E1" w:sz="2"/>
+          <w:insideH w:val="single" w:color="CBD5E1" w:sz="2"/>
+          <w:insideV w:val="single" w:color="CBD5E1" w:sz="2"/>
+        </w:tblBorders>
+        <w:tblLayout w:type="fixed"/>
+      </w:tblPr>
+      <w:tblGrid>
+        <w:gridCol w:w="2400"/>
+        <w:gridCol w:w="6960"/>
+      </w:tblGrid>
+      <w:tr>
+        <w:trPr>
+          <w:cantSplit/>
+          <w:tblHeader/>
+        </w:trPr>
+        <w:tc>
+          <w:tcPr>
+            <w:tcW w:type="dxa" w:w="2400"/>
+            <w:shd w:fill="0F172A" w:color="auto" w:val="clear"/>
+            <w:tcMar>
+              <w:top w:type="dxa" w:w="60"/>
+              <w:left w:type="dxa" w:w="100"/>
+              <w:bottom w:type="dxa" w:w="60"/>
+              <w:right w:type="dxa" w:w="100"/>
+            </w:tcMar>
+            <w:vAlign w:val="center"/>
+          </w:tcPr>
+          <w:p>
+            <w:r>
+              <w:rPr>
+                <w:b/>
+                <w:bCs/>
+                <w:color w:val="FFFFFF"/>
+                <w:sz w:val="18"/>
+                <w:szCs w:val="18"/>
+              </w:rPr>
+              <w:t xml:space="preserve">Field</w:t>
+            </w:r>
+          </w:p>
+        </w:tc>
+        <w:tc>
+          <w:tcPr>
+            <w:tcW w:type="dxa" w:w="6960"/>
+            <w:shd w:fill="0F172A" w:color="auto" w:val="clear"/>
+            <w:tcMar>
+              <w:top w:type="dxa" w:w="60"/>
+              <w:left w:type="dxa" w:w="100"/>
+              <w:bottom w:type="dxa" w:w="60"/>
+              <w:right w:type="dxa" w:w="100"/>
+            </w:tcMar>
+            <w:vAlign w:val="center"/>
+          </w:tcPr>
+          <w:p>
+            <w:r>
+              <w:rPr>
+                <w:b/>
+                <w:bCs/>
+                <w:color w:val="FFFFFF"/>
+                <w:sz w:val="18"/>
+                <w:szCs w:val="18"/>
+              </w:rPr>
+              <w:t xml:space="preserve">Details</w:t>
+            </w:r>
+          </w:p>
+        </w:tc>
+      </w:tr>
+      <w:tr>
+        <w:trPr>
+          <w:cantSplit/>
+        </w:trPr>
+        <w:tc>
+          <w:tcPr>
+            <w:tcW w:type="dxa" w:w="2400"/>
+            <w:tcMar>
+              <w:top w:type="dxa" w:w="60"/>
+              <w:left w:type="dxa" w:w="100"/>
+              <w:bottom w:type="dxa" w:w="60"/>
+              <w:right w:type="dxa" w:w="100"/>
+            </w:tcMar>
+            <w:vAlign w:val="center"/>
+          </w:tcPr>
+          <w:p>
+            <w:r>
+              <w:rPr>
+                <w:b w:val="false"/>
+                <w:bCs w:val="false"/>
+                <w:color w:val="1E293B"/>
+                <w:sz w:val="18"/>
+                <w:szCs w:val="18"/>
+              </w:rPr>
+              <w:t xml:space="preserve">Student Name</w:t>
+            </w:r>
+          </w:p>
+        </w:tc>
+        <w:tc>
+          <w:tcPr>
+            <w:tcW w:type="dxa" w:w="6960"/>
+            <w:tcMar>
+              <w:top w:type="dxa" w:w="60"/>
+              <w:left w:type="dxa" w:w="100"/>
+              <w:bottom w:type="dxa" w:w="60"/>
+              <w:right w:type="dxa" w:w="100"/>
+            </w:tcMar>
+            <w:vAlign w:val="center"/>
+          </w:tcPr>
+          <w:p>
+            <w:r>
+              <w:rPr>
+                <w:b w:val="false"/>
+                <w:bCs w:val="false"/>
+                <w:color w:val="1E293B"/>
+                <w:sz w:val="18"/>
+                <w:szCs w:val="18"/>
+              </w:rPr>
+              <w:t xml:space="preserve">Abdur-Rahmaan Muhammad Ali</w:t>
+            </w:r>
+          </w:p>
+        </w:tc>
+      </w:tr>
+      <w:tr>
+        <w:trPr>
+          <w:cantSplit/>
+        </w:trPr>
+        <w:tc>
+          <w:tcPr>
+            <w:tcW w:type="dxa" w:w="2400"/>
+            <w:shd w:fill="F8FAFC" w:color="auto" w:val="clear"/>
+            <w:tcMar>
+              <w:top w:type="dxa" w:w="60"/>
+              <w:left w:type="dxa" w:w="100"/>
+              <w:bottom w:type="dxa" w:w="60"/>
+              <w:right w:type="dxa" w:w="100"/>
+            </w:tcMar>
+            <w:vAlign w:val="center"/>
+          </w:tcPr>
+          <w:p>
+            <w:r>
+              <w:rPr>
+                <w:b w:val="false"/>
+                <w:bCs w:val="false"/>
+                <w:color w:val="1E293B"/>
+                <w:sz w:val="18"/>
+                <w:szCs w:val="18"/>
+              </w:rPr>
+              <w:t xml:space="preserve">Student ID</w:t>
+            </w:r>
+          </w:p>
+        </w:tc>
+        <w:tc>
+          <w:tcPr>
+            <w:tcW w:type="dxa" w:w="6960"/>
+            <w:shd w:fill="F8FAFC" w:color="auto" w:val="clear"/>
+            <w:tcMar>
+              <w:top w:type="dxa" w:w="60"/>
+              <w:left w:type="dxa" w:w="100"/>
+              <w:bottom w:type="dxa" w:w="60"/>
+              <w:right w:type="dxa" w:w="100"/>
+            </w:tcMar>
+            <w:vAlign w:val="center"/>
+          </w:tcPr>
+          <w:p>
+            <w:r>
+              <w:rPr>
+                <w:b w:val="false"/>
+                <w:bCs w:val="false"/>
+                <w:color w:val="1E293B"/>
+                <w:sz w:val="18"/>
+                <w:szCs w:val="18"/>
+              </w:rPr>
+              <w:t xml:space="preserve">ST10201821</w:t>
+            </w:r>
+          </w:p>
+        </w:tc>
+      </w:tr>
+      <w:tr>
+        <w:trPr>
+          <w:cantSplit/>
+        </w:trPr>
+        <w:tc>
+          <w:tcPr>
+            <w:tcW w:type="dxa" w:w="2400"/>
+            <w:tcMar>
+              <w:top w:type="dxa" w:w="60"/>
+              <w:left w:type="dxa" w:w="100"/>
+              <w:bottom w:type="dxa" w:w="60"/>
+              <w:right w:type="dxa" w:w="100"/>
+            </w:tcMar>
+            <w:vAlign w:val="center"/>
+          </w:tcPr>
+          <w:p>
+            <w:r>
+              <w:rPr>
+                <w:b w:val="false"/>
+                <w:bCs w:val="false"/>
+                <w:color w:val="1E293B"/>
+                <w:sz w:val="18"/>
+                <w:szCs w:val="18"/>
+              </w:rPr>
+              <w:t xml:space="preserve">Course Code</w:t>
+            </w:r>
+          </w:p>
+        </w:tc>
+        <w:tc>
+          <w:tcPr>
+            <w:tcW w:type="dxa" w:w="6960"/>
+            <w:tcMar>
+              <w:top w:type="dxa" w:w="60"/>
+              <w:left w:type="dxa" w:w="100"/>
+              <w:bottom w:type="dxa" w:w="60"/>
+              <w:right w:type="dxa" w:w="100"/>
+            </w:tcMar>
+            <w:vAlign w:val="center"/>
+          </w:tcPr>
+          <w:p>
+            <w:r>
+              <w:rPr>
+                <w:b w:val="false"/>
+                <w:bCs w:val="false"/>
+                <w:color w:val="1E293B"/>
+                <w:sz w:val="18"/>
+                <w:szCs w:val="18"/>
+              </w:rPr>
+              <w:t xml:space="preserve">IT402 — IT Capstone II</w:t>
+            </w:r>
+          </w:p>
+        </w:tc>
+      </w:tr>
+      <w:tr>
+        <w:trPr>
+          <w:cantSplit/>
+        </w:trPr>
+        <w:tc>
+          <w:tcPr>
+            <w:tcW w:type="dxa" w:w="2400"/>
+            <w:shd w:fill="F8FAFC" w:color="auto" w:val="clear"/>
+            <w:tcMar>
+              <w:top w:type="dxa" w:w="60"/>
+              <w:left w:type="dxa" w:w="100"/>
+              <w:bottom w:type="dxa" w:w="60"/>
+              <w:right w:type="dxa" w:w="100"/>
+            </w:tcMar>
+            <w:vAlign w:val="center"/>
+          </w:tcPr>
+          <w:p>
+            <w:r>
+              <w:rPr>
+                <w:b w:val="false"/>
+                <w:bCs w:val="false"/>
+                <w:color w:val="1E293B"/>
+                <w:sz w:val="18"/>
+                <w:szCs w:val="18"/>
+              </w:rPr>
+              <w:t xml:space="preserve">Project Name</w:t>
+            </w:r>
+          </w:p>
+        </w:tc>
+        <w:tc>
+          <w:tcPr>
+            <w:tcW w:type="dxa" w:w="6960"/>
+            <w:shd w:fill="F8FAFC" w:color="auto" w:val="clear"/>
+            <w:tcMar>
+              <w:top w:type="dxa" w:w="60"/>
+              <w:left w:type="dxa" w:w="100"/>
+              <w:bottom w:type="dxa" w:w="60"/>
+              <w:right w:type="dxa" w:w="100"/>
+            </w:tcMar>
+            <w:vAlign w:val="center"/>
+          </w:tcPr>
+          <w:p>
+            <w:r>
+              <w:rPr>
+                <w:b w:val="false"/>
+                <w:bCs w:val="false"/>
+                <w:color w:val="1E293B"/>
+                <w:sz w:val="18"/>
+                <w:szCs w:val="18"/>
+              </w:rPr>
+              <w:t xml:space="preserve">RentalPro — Digital Rental Management System</w:t>
+            </w:r>
+          </w:p>
+        </w:tc>
+      </w:tr>
+      <w:tr>
+        <w:trPr>
+          <w:cantSplit/>
+        </w:trPr>
+        <w:tc>
+          <w:tcPr>
+            <w:tcW w:type="dxa" w:w="2400"/>
+            <w:tcMar>
+              <w:top w:type="dxa" w:w="60"/>
+              <w:left w:type="dxa" w:w="100"/>
+              <w:bottom w:type="dxa" w:w="60"/>
+              <w:right w:type="dxa" w:w="100"/>
+            </w:tcMar>
+            <w:vAlign w:val="center"/>
+          </w:tcPr>
+          <w:p>
+            <w:r>
+              <w:rPr>
+                <w:b w:val="false"/>
+                <w:bCs w:val="false"/>
+                <w:color w:val="1E293B"/>
+                <w:sz w:val="18"/>
+                <w:szCs w:val="18"/>
+              </w:rPr>
+              <w:t xml:space="preserve">Deliverable</w:t>
+            </w:r>
+          </w:p>
+        </w:tc>
+        <w:tc>
+          <w:tcPr>
+            <w:tcW w:type="dxa" w:w="6960"/>
+            <w:tcMar>
+              <w:top w:type="dxa" w:w="60"/>
+              <w:left w:type="dxa" w:w="100"/>
+              <w:bottom w:type="dxa" w:w="60"/>
+              <w:right w:type="dxa" w:w="100"/>
+            </w:tcMar>
+            <w:vAlign w:val="center"/>
+          </w:tcPr>
+          <w:p>
+            <w:r>
+              <w:rPr>
+                <w:b w:val="false"/>
+                <w:bCs w:val="false"/>
+                <w:color w:val="1E293B"/>
+                <w:sz w:val="18"/>
+                <w:szCs w:val="18"/>
+              </w:rPr>
+              <w:t>IT402 Deliverable 3 — Project Demo, Presentation and Final Report</w:t>
+            </w:r>
+          </w:p>
+        </w:tc>
+      </w:tr>
+      <w:tr>
+        <w:trPr>
+          <w:cantSplit/>
+        </w:trPr>
+        <w:tc>
+          <w:tcPr>
+            <w:tcW w:type="dxa" w:w="2400"/>
+            <w:shd w:fill="F8FAFC" w:color="auto" w:val="clear"/>
+            <w:tcMar>
+              <w:top w:type="dxa" w:w="60"/>
+              <w:left w:type="dxa" w:w="100"/>
+              <w:bottom w:type="dxa" w:w="60"/>
+              <w:right w:type="dxa" w:w="100"/>
+            </w:tcMar>
+            <w:vAlign w:val="center"/>
+          </w:tcPr>
+          <w:p>
+            <w:r>
+              <w:rPr>
+                <w:b w:val="false"/>
+                <w:bCs w:val="false"/>
+                <w:color w:val="1E293B"/>
+                <w:sz w:val="18"/>
+                <w:szCs w:val="18"/>
+              </w:rPr>
+              <w:t xml:space="preserve">Version</w:t>
+            </w:r>
+          </w:p>
+        </w:tc>
+        <w:tc>
+          <w:tcPr>
+            <w:tcW w:type="dxa" w:w="6960"/>
+            <w:shd w:fill="F8FAFC" w:color="auto" w:val="clear"/>
+            <w:tcMar>
+              <w:top w:type="dxa" w:w="60"/>
+              <w:left w:type="dxa" w:w="100"/>
+              <w:bottom w:type="dxa" w:w="60"/>
+              <w:right w:type="dxa" w:w="100"/>
+            </w:tcMar>
+            <w:vAlign w:val="center"/>
+          </w:tcPr>
+          <w:p>
+            <w:r>
+              <w:rPr>
+                <w:b w:val="false"/>
+                <w:bCs w:val="false"/>
+                <w:color w:val="1E293B"/>
+                <w:sz w:val="18"/>
+                <w:szCs w:val="18"/>
+              </w:rPr>
+              <w:t>v1.0 — October 2026</w:t>
+            </w:r>
+          </w:p>
+        </w:tc>
+      </w:tr>
+      <w:tr>
+        <w:trPr>
+          <w:cantSplit/>
+        </w:trPr>
+        <w:tc>
+          <w:tcPr>
+            <w:tcW w:type="dxa" w:w="2400"/>
+            <w:tcMar>
+              <w:top w:type="dxa" w:w="60"/>
+              <w:left w:type="dxa" w:w="100"/>
+              <w:bottom w:type="dxa" w:w="60"/>
+              <w:right w:type="dxa" w:w="100"/>
+            </w:tcMar>
+            <w:vAlign w:val="center"/>
+          </w:tcPr>
+          <w:p>
+            <w:r>
+              <w:rPr>
+                <w:b w:val="false"/>
+                <w:bCs w:val="false"/>
+                <w:color w:val="1E293B"/>
+                <w:sz w:val="18"/>
+                <w:szCs w:val="18"/>
+              </w:rPr>
+              <w:t xml:space="preserve">Sections</w:t>
+            </w:r>
+          </w:p>
+        </w:tc>
+        <w:tc>
+          <w:tcPr>
+            <w:tcW w:type="dxa" w:w="6960"/>
+            <w:tcMar>
+              <w:top w:type="dxa" w:w="60"/>
+              <w:left w:type="dxa" w:w="100"/>
+              <w:bottom w:type="dxa" w:w="60"/>
+              <w:right w:type="dxa" w:w="100"/>
+            </w:tcMar>
+            <w:vAlign w:val="center"/>
+          </w:tcPr>
+          <w:p>
+            <w:r>
+              <w:rPr>
+                <w:b w:val="false"/>
+                <w:bCs w:val="false"/>
+                <w:color w:val="1E293B"/>
+                <w:sz w:val="18"/>
+                <w:szCs w:val="18"/>
+              </w:rPr>
+              <w:t>Executive Summary · Project Overview &amp; Objectives · Deliverables Summary · System Architecture · Key Features · Testing &amp; Quality Assurance · Challenges &amp; Lessons Learned · Conclusion</w:t>
+            </w:r>
+          </w:p>
+        </w:tc>
+      </w:tr>
+      <w:tr>
+        <w:trPr>
+          <w:cantSplit/>
+        </w:trPr>
+        <w:tc>
+          <w:tcPr>
+            <w:tcW w:type="dxa" w:w="2400"/>
+            <w:shd w:fill="F8FAFC" w:color="auto" w:val="clear"/>
+            <w:tcMar>
+              <w:top w:type="dxa" w:w="60"/>
+              <w:left w:type="dxa" w:w="100"/>
+              <w:bottom w:type="dxa" w:w="60"/>
+              <w:right w:type="dxa" w:w="100"/>
+            </w:tcMar>
+            <w:vAlign w:val="center"/>
+          </w:tcPr>
+          <w:p>
+            <w:r>
+              <w:rPr>
+                <w:b w:val="false"/>
+                <w:bCs w:val="false"/>
+                <w:color w:val="1E293B"/>
+                <w:sz w:val="18"/>
+                <w:szCs w:val="18"/>
+              </w:rPr>
+              <w:t xml:space="preserve">Appendix</w:t>
+            </w:r>
+          </w:p>
+        </w:tc>
+        <w:tc>
+          <w:tcPr>
+            <w:tcW w:type="dxa" w:w="6960"/>
+            <w:shd w:fill="F8FAFC" w:color="auto" w:val="clear"/>
+            <w:tcMar>
+              <w:top w:type="dxa" w:w="60"/>
+              <w:left w:type="dxa" w:w="100"/>
+              <w:bottom w:type="dxa" w:w="60"/>
+              <w:right w:type="dxa" w:w="100"/>
+            </w:tcMar>
+            <w:vAlign w:val="center"/>
+          </w:tcPr>
+          <w:p>
+            <w:r>
+              <w:rPr>
+                <w:b w:val="false"/>
+                <w:bCs w:val="false"/>
+                <w:color w:val="1E293B"/>
+                <w:sz w:val="18"/>
+                <w:szCs w:val="18"/>
+              </w:rPr>
+              <w:t>Appendix — Project Statistics Summary</w:t>
+            </w:r>
+          </w:p>
+        </w:tc>
+      </w:tr>
+      <w:tr>
+        <w:trPr>
+          <w:cantSplit/>
+        </w:trPr>
+        <w:tc>
+          <w:tcPr>
+            <w:tcW w:type="dxa" w:w="2400"/>
+            <w:shd w:fill="F8FAFC" w:color="auto" w:val="clear"/>
+            <w:tcMar>
+              <w:top w:type="dxa" w:w="60"/>
+              <w:left w:type="dxa" w:w="100"/>
+              <w:bottom w:type="dxa" w:w="60"/>
+              <w:right w:type="dxa" w:w="100"/>
+            </w:tcMar>
+            <w:vAlign w:val="center"/>
+          </w:tcPr>
+          <w:p>
+            <w:r>
+              <w:rPr>
+                <w:b w:val="false"/>
+                <w:bCs w:val="false"/>
+                <w:color w:val="1E293B"/>
+                <w:sz w:val="18"/>
+                <w:szCs w:val="18"/>
+              </w:rPr>
+              <w:t>Accompanying Files</w:t>
+            </w:r>
+          </w:p>
+        </w:tc>
+        <w:tc>
+          <w:tcPr>
+            <w:tcW w:type="dxa" w:w="6960"/>
+            <w:shd w:fill="F8FAFC" w:color="auto" w:val="clear"/>
+            <w:tcMar>
+              <w:top w:type="dxa" w:w="60"/>
+              <w:left w:type="dxa" w:w="100"/>
+              <w:bottom w:type="dxa" w:w="60"/>
+              <w:right w:type="dxa" w:w="100"/>
+            </w:tcMar>
+            <w:vAlign w:val="center"/>
+          </w:tcPr>
+          <w:p>
+            <w:r>
+              <w:rPr>
+                <w:b w:val="false"/>
+                <w:bCs w:val="false"/>
+                <w:color w:val="1E293B"/>
+                <w:sz w:val="18"/>
+                <w:szCs w:val="18"/>
+              </w:rPr>
+              <w:t>Project demo video (2:52) · Presentation video (18:04) · Presentation slides (PowerPoint and PDF)</w:t>
+            </w:r>
+          </w:p>
+        </w:tc>
+      </w:tr>
+      <w:tr>
+        <w:trPr>
+          <w:cantSplit/>
+        </w:trPr>
+        <w:tc>
+          <w:tcPr>
+            <w:tcW w:type="dxa" w:w="2400"/>
+            <w:tcMar>
+              <w:top w:type="dxa" w:w="60"/>
+              <w:left w:type="dxa" w:w="100"/>
+              <w:bottom w:type="dxa" w:w="60"/>
+              <w:right w:type="dxa" w:w="100"/>
+            </w:tcMar>
+            <w:vAlign w:val="center"/>
+          </w:tcPr>
+          <w:p>
+            <w:r>
+              <w:rPr>
+                <w:b w:val="false"/>
+                <w:bCs w:val="false"/>
+                <w:color w:val="1E293B"/>
+                <w:sz w:val="18"/>
+                <w:szCs w:val="18"/>
+              </w:rPr>
+              <w:t xml:space="preserve">Prior Deliverables</w:t>
+            </w:r>
+          </w:p>
+        </w:tc>
+        <w:tc>
+          <w:tcPr>
+            <w:tcW w:type="dxa" w:w="6960"/>
+            <w:tcMar>
+              <w:top w:type="dxa" w:w="60"/>
+              <w:left w:type="dxa" w:w="100"/>
+              <w:bottom w:type="dxa" w:w="60"/>
+              <w:right w:type="dxa" w:w="100"/>
+            </w:tcMar>
+            <w:vAlign w:val="center"/>
+          </w:tcPr>
+          <w:p>
+            <w:r>
+              <w:rPr>
+                <w:b w:val="false"/>
+                <w:bCs w:val="false"/>
+                <w:color w:val="1E293B"/>
+                <w:sz w:val="18"/>
+                <w:szCs w:val="18"/>
+              </w:rPr>
+              <w:t>IT401 Deliverable 1 — SRS · IT401 Deliverable 2 — UML &amp; Database Design · IT401 Deliverable 3 — Partially-Developed Application · IT402 Deliverable 1 — Complete Project Report · IT402 Deliverable 2 — Feature Completion</w:t>
+            </w:r>
+          </w:p>
+        </w:tc>
+      </w:tr>
+    </w:tbl>
     <w:p>
       <w:r>
         <w:br w:type="page"/>
@@ -202,7 +763,7 @@
               <w:fldChar w:fldCharType="begin"/>
               <w:instrText xml:space="preserve"> PAGEREF _Toc90000003 \h </w:instrText>
               <w:fldChar w:fldCharType="separate"/>
-              <w:t>3</w:t>
+              <w:t>4</w:t>
               <w:fldChar w:fldCharType="end"/>
             </w:r>
           </w:hyperlink>
@@ -229,7 +790,7 @@
           </w:pPr>
           <w:hyperlink w:anchor="_Toc90000005" w:history="1">
             <w:r>
-              <w:t xml:space="preserve">3.1 IT401 Deliverable 3 — Working Prototype</w:t>
+              <w:t xml:space="preserve">3.1 IT401 Deliverable 3 — Partially-Developed Application</w:t>
               <w:tab/>
               <w:fldChar w:fldCharType="begin"/>
               <w:instrText xml:space="preserve"> PAGEREF _Toc90000005 \h </w:instrText>
@@ -559,7 +1120,8 @@
     </w:p>
     <w:p>
       <w:pPr>
-        <w:spacing w:after="180" w:line="300"/>
+        <w:spacing w:after="180" w:line="276" w:lineRule="auto"/>
+        <w:jc w:val="both"/>
       </w:pPr>
       <w:r>
         <w:rPr>
@@ -572,7 +1134,8 @@
     </w:p>
     <w:p>
       <w:pPr>
-        <w:spacing w:after="180" w:line="300"/>
+        <w:spacing w:after="180" w:line="276" w:lineRule="auto"/>
+        <w:jc w:val="both"/>
       </w:pPr>
       <w:r>
         <w:rPr>
@@ -585,7 +1148,8 @@
     </w:p>
     <w:p>
       <w:pPr>
-        <w:spacing w:after="180" w:line="300"/>
+        <w:spacing w:after="180" w:line="276" w:lineRule="auto"/>
+        <w:jc w:val="both"/>
       </w:pPr>
       <w:r>
         <w:rPr>
@@ -616,7 +1180,8 @@
     </w:p>
     <w:p>
       <w:pPr>
-        <w:spacing w:after="180" w:line="300"/>
+        <w:spacing w:after="180" w:line="276" w:lineRule="auto"/>
+        <w:jc w:val="both"/>
       </w:pPr>
       <w:r>
         <w:rPr>
@@ -637,7 +1202,7 @@
         <w:rPr>
           <w:b/>
           <w:bCs/>
-          <w:color w:val="2563EB"/>
+          <w:color w:val="0F172A"/>
           <w:sz w:val="26"/>
           <w:szCs w:val="26"/>
         </w:rPr>
@@ -805,7 +1370,8 @@
     </w:p>
     <w:p>
       <w:pPr>
-        <w:spacing w:after="180" w:line="300"/>
+        <w:spacing w:after="180" w:line="276" w:lineRule="auto"/>
+        <w:jc w:val="both"/>
       </w:pPr>
       <w:r>
         <w:rPr>
@@ -857,7 +1423,7 @@
                 <w:b/>
                 <w:bCs/>
                 <w:color w:val="FFFFFF"/>
-                <w:sz w:val="20"/>
+                <w:sz w:val="18"/>
                 <w:szCs w:val="20"/>
               </w:rPr>
               <w:t xml:space="preserve">Deliverable</w:t>
@@ -884,7 +1450,7 @@
                 <w:b/>
                 <w:bCs/>
                 <w:color w:val="FFFFFF"/>
-                <w:sz w:val="20"/>
+                <w:sz w:val="18"/>
                 <w:szCs w:val="20"/>
               </w:rPr>
               <w:t xml:space="preserve">What It Delivered</w:t>
@@ -911,7 +1477,7 @@
                 <w:b/>
                 <w:bCs/>
                 <w:color w:val="FFFFFF"/>
-                <w:sz w:val="20"/>
+                <w:sz w:val="18"/>
                 <w:szCs w:val="20"/>
               </w:rPr>
               <w:t xml:space="preserve">Status</w:t>
@@ -940,7 +1506,7 @@
                 <w:b w:val="false"/>
                 <w:bCs w:val="false"/>
                 <w:color w:val="1E293B"/>
-                <w:sz w:val="20"/>
+                <w:sz w:val="18"/>
                 <w:szCs w:val="20"/>
               </w:rPr>
               <w:t xml:space="preserve">IT401 D1 — SRS</w:t>
@@ -967,7 +1533,7 @@
                 <w:b w:val="false"/>
                 <w:bCs w:val="false"/>
                 <w:color w:val="1E293B"/>
-                <w:sz w:val="20"/>
+                <w:sz w:val="18"/>
                 <w:szCs w:val="20"/>
               </w:rPr>
               <w:t xml:space="preserve">25 use cases across 6 functional areas: auth/RBAC, property &amp; unit management, tenant lifecycle, rent &amp; payments, maintenance, and reporting</w:t>
@@ -994,7 +1560,7 @@
                 <w:b w:val="false"/>
                 <w:bCs w:val="false"/>
                 <w:color w:val="1E293B"/>
-                <w:sz w:val="20"/>
+                <w:sz w:val="18"/>
                 <w:szCs w:val="20"/>
               </w:rPr>
               <w:t xml:space="preserve">Complete</w:t>
@@ -1023,7 +1589,7 @@
                 <w:b w:val="false"/>
                 <w:bCs w:val="false"/>
                 <w:color w:val="1E293B"/>
-                <w:sz w:val="20"/>
+                <w:sz w:val="18"/>
                 <w:szCs w:val="20"/>
               </w:rPr>
               <w:t xml:space="preserve">IT401 D2 — UML &amp; DB Design</w:t>
@@ -1050,7 +1616,7 @@
                 <w:b w:val="false"/>
                 <w:bCs w:val="false"/>
                 <w:color w:val="1E293B"/>
-                <w:sz w:val="20"/>
+                <w:sz w:val="18"/>
                 <w:szCs w:val="20"/>
               </w:rPr>
               <w:t xml:space="preserve">UML class model and a 13-table normalized relational schema with UUID foreign keys, carried through to the build unchanged</w:t>
@@ -1077,7 +1643,7 @@
                 <w:b w:val="false"/>
                 <w:bCs w:val="false"/>
                 <w:color w:val="1E293B"/>
-                <w:sz w:val="20"/>
+                <w:sz w:val="18"/>
                 <w:szCs w:val="20"/>
               </w:rPr>
               <w:t xml:space="preserve">Complete</w:t>
@@ -1106,10 +1672,10 @@
                 <w:b w:val="false"/>
                 <w:bCs w:val="false"/>
                 <w:color w:val="1E293B"/>
-                <w:sz w:val="20"/>
-                <w:szCs w:val="20"/>
-              </w:rPr>
-              <w:t xml:space="preserve">IT401 D3 — Working Prototype</w:t>
+                <w:sz w:val="18"/>
+                <w:szCs w:val="20"/>
+              </w:rPr>
+              <w:t>IT401 D3 — Partially-Developed Application</w:t>
             </w:r>
           </w:p>
         </w:tc>
@@ -1133,7 +1699,7 @@
                 <w:b w:val="false"/>
                 <w:bCs w:val="false"/>
                 <w:color w:val="1E293B"/>
-                <w:sz w:val="20"/>
+                <w:sz w:val="18"/>
                 <w:szCs w:val="20"/>
               </w:rPr>
               <w:t>A working Flask application implementing the SRS, with an initial automated test suite (93 tests, 77% coverage); its report records that build as submitted</w:t>
@@ -1160,7 +1726,7 @@
                 <w:b w:val="false"/>
                 <w:bCs w:val="false"/>
                 <w:color w:val="1E293B"/>
-                <w:sz w:val="20"/>
+                <w:sz w:val="18"/>
                 <w:szCs w:val="20"/>
               </w:rPr>
               <w:t xml:space="preserve">Complete</w:t>
@@ -1189,7 +1755,7 @@
                 <w:b w:val="false"/>
                 <w:bCs w:val="false"/>
                 <w:color w:val="1E293B"/>
-                <w:sz w:val="20"/>
+                <w:sz w:val="18"/>
                 <w:szCs w:val="20"/>
               </w:rPr>
               <w:t xml:space="preserve">IT402 D1 — Project Report</w:t>
@@ -1216,7 +1782,7 @@
                 <w:b w:val="false"/>
                 <w:bCs w:val="false"/>
                 <w:color w:val="1E293B"/>
-                <w:sz w:val="20"/>
+                <w:sz w:val="18"/>
                 <w:szCs w:val="20"/>
               </w:rPr>
               <w:t>Complete 7-chapter report (Introduction, OOA, OOD, Database Design, Software Development, Testing, Conclusion) plus Appendices A &amp; B, as submitted, with a closing appendix on later changes</w:t>
@@ -1243,7 +1809,7 @@
                 <w:b w:val="false"/>
                 <w:bCs w:val="false"/>
                 <w:color w:val="1E293B"/>
-                <w:sz w:val="20"/>
+                <w:sz w:val="18"/>
                 <w:szCs w:val="20"/>
               </w:rPr>
               <w:t xml:space="preserve">Complete</w:t>
@@ -1272,7 +1838,7 @@
                 <w:b w:val="false"/>
                 <w:bCs w:val="false"/>
                 <w:color w:val="1E293B"/>
-                <w:sz w:val="20"/>
+                <w:sz w:val="18"/>
                 <w:szCs w:val="20"/>
               </w:rPr>
               <w:t xml:space="preserve">IT402 D2 — 100% Feature Completion</w:t>
@@ -1299,7 +1865,7 @@
                 <w:b w:val="false"/>
                 <w:bCs w:val="false"/>
                 <w:color w:val="1E293B"/>
-                <w:sz w:val="20"/>
+                <w:sz w:val="18"/>
                 <w:szCs w:val="20"/>
               </w:rPr>
               <w:t>11 remaining SRS gaps closed: unit editing, photo uploads, tenant ID and lease documents, late fees, tenant blacklisting, admin console, staff self-service, CSV/Excel export — all covered by a dedicated 31-test module</w:t>
@@ -1326,7 +1892,7 @@
                 <w:b w:val="false"/>
                 <w:bCs w:val="false"/>
                 <w:color w:val="1E293B"/>
-                <w:sz w:val="20"/>
+                <w:sz w:val="18"/>
                 <w:szCs w:val="20"/>
               </w:rPr>
               <w:t xml:space="preserve">Complete</w:t>
@@ -1355,7 +1921,7 @@
                 <w:b w:val="false"/>
                 <w:bCs w:val="false"/>
                 <w:color w:val="1E293B"/>
-                <w:sz w:val="20"/>
+                <w:sz w:val="18"/>
                 <w:szCs w:val="20"/>
               </w:rPr>
               <w:t xml:space="preserve">IT402 D3 — Demo, Presentation &amp; Final Report</w:t>
@@ -1382,7 +1948,7 @@
                 <w:b w:val="false"/>
                 <w:bCs w:val="false"/>
                 <w:color w:val="1E293B"/>
-                <w:sz w:val="20"/>
+                <w:sz w:val="18"/>
                 <w:szCs w:val="20"/>
               </w:rPr>
               <w:t xml:space="preserve">Recorded application walkthrough, a presentation video with full narration script, and this final capstone report</w:t>
@@ -1409,7 +1975,7 @@
                 <w:b w:val="false"/>
                 <w:bCs w:val="false"/>
                 <w:color w:val="1E293B"/>
-                <w:sz w:val="20"/>
+                <w:sz w:val="18"/>
                 <w:szCs w:val="20"/>
               </w:rPr>
               <w:t xml:space="preserve">Complete</w:t>
@@ -1438,7 +2004,7 @@
                 <w:b w:val="false"/>
                 <w:bCs w:val="false"/>
                 <w:color w:val="1E293B"/>
-                <w:sz w:val="20"/>
+                <w:sz w:val="18"/>
                 <w:szCs w:val="20"/>
               </w:rPr>
               <w:t xml:space="preserve">Extended Scope — Billing Engine</w:t>
@@ -1465,7 +2031,7 @@
                 <w:b w:val="false"/>
                 <w:bCs w:val="false"/>
                 <w:color w:val="1E293B"/>
-                <w:sz w:val="20"/>
+                <w:sz w:val="18"/>
                 <w:szCs w:val="20"/>
               </w:rPr>
               <w:t>8 further billing capabilities beyond the original SRS: charges, metering, pro rata rent, variable rent, auto billing, statements, receipts, expenses — 79 dedicated tests</w:t>
@@ -1492,7 +2058,7 @@
                 <w:b w:val="false"/>
                 <w:bCs w:val="false"/>
                 <w:color w:val="1E293B"/>
-                <w:sz w:val="20"/>
+                <w:sz w:val="18"/>
                 <w:szCs w:val="20"/>
               </w:rPr>
               <w:t xml:space="preserve">Complete</w:t>
@@ -1521,7 +2087,7 @@
                 <w:b w:val="false"/>
                 <w:bCs w:val="false"/>
                 <w:color w:val="1E293B"/>
-                <w:sz w:val="20"/>
+                <w:sz w:val="18"/>
                 <w:szCs w:val="20"/>
               </w:rPr>
               <w:t xml:space="preserve">Extended Scope — Usability &amp; Localisation</w:t>
@@ -1548,7 +2114,7 @@
                 <w:b w:val="false"/>
                 <w:bCs w:val="false"/>
                 <w:color w:val="1E293B"/>
-                <w:sz w:val="20"/>
+                <w:sz w:val="18"/>
                 <w:szCs w:val="20"/>
               </w:rPr>
               <w:t xml:space="preserve">Property map, a redesigned top-bar interface with Harare photo backgrounds, English, Shona and Arabic interface languages with a right-to-left layout for Arabic, tenant-friendly unit labels, a logged-in redirect fix, and Harare demo data — 27 dedicated tests</w:t>
@@ -1575,7 +2141,7 @@
                 <w:b w:val="false"/>
                 <w:bCs w:val="false"/>
                 <w:color w:val="1E293B"/>
-                <w:sz w:val="20"/>
+                <w:sz w:val="18"/>
                 <w:szCs w:val="20"/>
               </w:rPr>
               <w:t xml:space="preserve">Complete</w:t>
@@ -1604,7 +2170,7 @@
                 <w:b w:val="false"/>
                 <w:bCs w:val="false"/>
                 <w:color w:val="1E293B"/>
-                <w:sz w:val="20"/>
+                <w:sz w:val="18"/>
                 <w:szCs w:val="20"/>
               </w:rPr>
               <w:t>Extended Scope — Full Arabic &amp; Hardening</w:t>
@@ -1631,7 +2197,7 @@
                 <w:b w:val="false"/>
                 <w:bCs w:val="false"/>
                 <w:color w:val="1E293B"/>
-                <w:sz w:val="20"/>
+                <w:sz w:val="18"/>
                 <w:szCs w:val="20"/>
               </w:rPr>
               <w:t>Arabic across every screen, message, email, SMS and PDF; currency on every amount; security headers and a required secret key; Alembic migrations; optional S3 file storage; deployment to Render</w:t>
@@ -1658,7 +2224,7 @@
                 <w:b w:val="false"/>
                 <w:bCs w:val="false"/>
                 <w:color w:val="1E293B"/>
-                <w:sz w:val="20"/>
+                <w:sz w:val="18"/>
                 <w:szCs w:val="20"/>
               </w:rPr>
               <w:t>Complete</w:t>
@@ -1677,17 +2243,18 @@
         <w:rPr>
           <w:b/>
           <w:bCs/>
-          <w:color w:val="2563EB"/>
+          <w:color w:val="0F172A"/>
           <w:sz w:val="26"/>
           <w:szCs w:val="26"/>
         </w:rPr>
-        <w:t xml:space="preserve">3.1 IT401 Deliverable 3 — Working Prototype</w:t>
+        <w:t>3.1 IT401 Deliverable 3 — Partially-Developed Application</w:t>
       </w:r>
       <w:bookmarkEnd w:id="904"/>
     </w:p>
     <w:p>
       <w:pPr>
-        <w:spacing w:after="180" w:line="300"/>
+        <w:spacing w:after="180" w:line="276" w:lineRule="auto"/>
+        <w:jc w:val="both"/>
       </w:pPr>
       <w:r>
         <w:rPr>
@@ -1708,7 +2275,7 @@
         <w:rPr>
           <w:b/>
           <w:bCs/>
-          <w:color w:val="2563EB"/>
+          <w:color w:val="0F172A"/>
           <w:sz w:val="26"/>
           <w:szCs w:val="26"/>
         </w:rPr>
@@ -1718,7 +2285,8 @@
     </w:p>
     <w:p>
       <w:pPr>
-        <w:spacing w:after="180" w:line="300"/>
+        <w:spacing w:after="180" w:line="276" w:lineRule="auto"/>
+        <w:jc w:val="both"/>
       </w:pPr>
       <w:r>
         <w:rPr>
@@ -1739,7 +2307,7 @@
         <w:rPr>
           <w:b/>
           <w:bCs/>
-          <w:color w:val="2563EB"/>
+          <w:color w:val="0F172A"/>
           <w:sz w:val="26"/>
           <w:szCs w:val="26"/>
         </w:rPr>
@@ -1749,7 +2317,8 @@
     </w:p>
     <w:p>
       <w:pPr>
-        <w:spacing w:after="180" w:line="300"/>
+        <w:spacing w:after="180" w:line="276" w:lineRule="auto"/>
+        <w:jc w:val="both"/>
       </w:pPr>
       <w:r>
         <w:rPr>
@@ -1942,7 +2511,8 @@
     </w:p>
     <w:p>
       <w:pPr>
-        <w:spacing w:after="180" w:line="300"/>
+        <w:spacing w:after="180" w:line="276" w:lineRule="auto"/>
+        <w:jc w:val="both"/>
       </w:pPr>
       <w:r>
         <w:rPr>
@@ -1963,7 +2533,7 @@
         <w:rPr>
           <w:b/>
           <w:bCs/>
-          <w:color w:val="2563EB"/>
+          <w:color w:val="0F172A"/>
           <w:sz w:val="26"/>
           <w:szCs w:val="26"/>
         </w:rPr>
@@ -1973,7 +2543,8 @@
     </w:p>
     <w:p>
       <w:pPr>
-        <w:spacing w:after="180" w:line="300"/>
+        <w:spacing w:after="180" w:line="276" w:lineRule="auto"/>
+        <w:jc w:val="both"/>
       </w:pPr>
       <w:r>
         <w:rPr>
@@ -2138,7 +2709,7 @@
         <w:rPr>
           <w:b/>
           <w:bCs/>
-          <w:color w:val="2563EB"/>
+          <w:color w:val="0F172A"/>
           <w:sz w:val="26"/>
           <w:szCs w:val="26"/>
         </w:rPr>
@@ -2148,7 +2719,8 @@
     </w:p>
     <w:p>
       <w:pPr>
-        <w:spacing w:after="180" w:line="300"/>
+        <w:spacing w:after="180" w:line="276" w:lineRule="auto"/>
+        <w:jc w:val="both"/>
       </w:pPr>
       <w:r>
         <w:rPr>
@@ -2269,7 +2841,8 @@
     </w:p>
     <w:p>
       <w:pPr>
-        <w:spacing w:after="180" w:line="300"/>
+        <w:spacing w:after="180" w:line="276" w:lineRule="auto"/>
+        <w:jc w:val="both"/>
       </w:pPr>
       <w:r>
         <w:rPr>
@@ -2290,7 +2863,7 @@
         <w:rPr>
           <w:b/>
           <w:bCs/>
-          <w:color w:val="2563EB"/>
+          <w:color w:val="0F172A"/>
           <w:sz w:val="26"/>
           <w:szCs w:val="26"/>
         </w:rPr>
@@ -2300,7 +2873,8 @@
     </w:p>
     <w:p>
       <w:pPr>
-        <w:spacing w:after="180" w:line="300"/>
+        <w:spacing w:after="180" w:line="276" w:lineRule="auto"/>
+        <w:jc w:val="both"/>
       </w:pPr>
       <w:r>
         <w:rPr>
@@ -2475,7 +3049,8 @@
     </w:p>
     <w:p>
       <w:pPr>
-        <w:spacing w:after="180" w:line="300"/>
+        <w:spacing w:after="180" w:line="276" w:lineRule="auto"/>
+        <w:jc w:val="both"/>
       </w:pPr>
       <w:r>
         <w:rPr>
@@ -2526,7 +3101,7 @@
                 <w:b/>
                 <w:bCs/>
                 <w:color w:val="FFFFFF"/>
-                <w:sz w:val="20"/>
+                <w:sz w:val="18"/>
                 <w:szCs w:val="20"/>
               </w:rPr>
               <w:t xml:space="preserve">Layer</w:t>
@@ -2553,7 +3128,7 @@
                 <w:b/>
                 <w:bCs/>
                 <w:color w:val="FFFFFF"/>
-                <w:sz w:val="20"/>
+                <w:sz w:val="18"/>
                 <w:szCs w:val="20"/>
               </w:rPr>
               <w:t xml:space="preserve">Contents</w:t>
@@ -2582,7 +3157,7 @@
                 <w:b w:val="false"/>
                 <w:bCs w:val="false"/>
                 <w:color w:val="1E293B"/>
-                <w:sz w:val="20"/>
+                <w:sz w:val="18"/>
                 <w:szCs w:val="20"/>
               </w:rPr>
               <w:t xml:space="preserve">Presentation</w:t>
@@ -2609,7 +3184,7 @@
                 <w:b w:val="false"/>
                 <w:bCs w:val="false"/>
                 <w:color w:val="1E293B"/>
-                <w:sz w:val="20"/>
+                <w:sz w:val="18"/>
                 <w:szCs w:val="20"/>
               </w:rPr>
               <w:t>40 Jinja2 templates behind a role-aware top navigation bar with an English/Shona/Arabic language menu, plus a shared design system in static/css/style.css and all page scripts in static/js (no inline code)</w:t>
@@ -2638,7 +3213,7 @@
                 <w:b w:val="false"/>
                 <w:bCs w:val="false"/>
                 <w:color w:val="1E293B"/>
-                <w:sz w:val="20"/>
+                <w:sz w:val="18"/>
                 <w:szCs w:val="20"/>
               </w:rPr>
               <w:t xml:space="preserve">Application</w:t>
@@ -2665,7 +3240,7 @@
                 <w:b w:val="false"/>
                 <w:bCs w:val="false"/>
                 <w:color w:val="1E293B"/>
-                <w:sz w:val="20"/>
+                <w:sz w:val="18"/>
                 <w:szCs w:val="20"/>
               </w:rPr>
               <w:t xml:space="preserve">10 Flask Blueprints: auth, dashboard, properties, tenants, rent, maintenance, admin, reports, portal, api</w:t>
@@ -2694,7 +3269,7 @@
                 <w:b w:val="false"/>
                 <w:bCs w:val="false"/>
                 <w:color w:val="1E293B"/>
-                <w:sz w:val="20"/>
+                <w:sz w:val="18"/>
                 <w:szCs w:val="20"/>
               </w:rPr>
               <w:t xml:space="preserve">Domain / Service</w:t>
@@ -2721,7 +3296,7 @@
                 <w:b w:val="false"/>
                 <w:bCs w:val="false"/>
                 <w:color w:val="1E293B"/>
-                <w:sz w:val="20"/>
+                <w:sz w:val="18"/>
                 <w:szCs w:val="20"/>
               </w:rPr>
               <w:t>security.py (RBAC, IDOR, validation, audit log), web_security.py (security headers, secret-key check), i18n.py (English/Shona/Arabic translation, right-to-left for Arabic, currency formatting), scheduler_jobs.py (5 background jobs), services/ (notifications, payments, pdf, excel, reports, storage)</w:t>
@@ -2750,7 +3325,7 @@
                 <w:b w:val="false"/>
                 <w:bCs w:val="false"/>
                 <w:color w:val="1E293B"/>
-                <w:sz w:val="20"/>
+                <w:sz w:val="18"/>
                 <w:szCs w:val="20"/>
               </w:rPr>
               <w:t xml:space="preserve">Data</w:t>
@@ -2777,7 +3352,7 @@
                 <w:b w:val="false"/>
                 <w:bCs w:val="false"/>
                 <w:color w:val="1E293B"/>
-                <w:sz w:val="20"/>
+                <w:sz w:val="18"/>
                 <w:szCs w:val="20"/>
               </w:rPr>
               <w:t>18 SQLAlchemy models with String(36) UUID primary keys, naive UTC datetimes, and business logic (balances, numbering, occupancy, billing) on the model itself; the schema is managed by Alembic migrations</w:t>
@@ -2806,7 +3381,7 @@
                 <w:b w:val="false"/>
                 <w:bCs w:val="false"/>
                 <w:color w:val="1E293B"/>
-                <w:sz w:val="20"/>
+                <w:sz w:val="18"/>
                 <w:szCs w:val="20"/>
               </w:rPr>
               <w:t xml:space="preserve">Infrastructure</w:t>
@@ -2833,7 +3408,7 @@
                 <w:b w:val="false"/>
                 <w:bCs w:val="false"/>
                 <w:color w:val="1E293B"/>
-                <w:sz w:val="20"/>
+                <w:sz w:val="18"/>
                 <w:szCs w:val="20"/>
               </w:rPr>
               <w:t>PostgreSQL (production) / SQLite (dev &amp; test), Redis (caching, rate limiting), Docker Compose, uploads on local disk or in an S3-compatible bucket, with a dev-mode fallback for SendGrid, Twilio, and Stripe</w:t>
@@ -2844,7 +3419,8 @@
     </w:tbl>
     <w:p>
       <w:pPr>
-        <w:spacing w:after="180" w:line="300"/>
+        <w:spacing w:after="180" w:line="276" w:lineRule="auto"/>
+        <w:jc w:val="both"/>
       </w:pPr>
       <w:r>
         <w:rPr>
@@ -2883,7 +3459,7 @@
         <w:rPr>
           <w:b/>
           <w:bCs/>
-          <w:color w:val="2563EB"/>
+          <w:color w:val="0F172A"/>
           <w:sz w:val="26"/>
           <w:szCs w:val="26"/>
         </w:rPr>
@@ -2931,7 +3507,7 @@
                 <w:b/>
                 <w:bCs/>
                 <w:color w:val="FFFFFF"/>
-                <w:sz w:val="20"/>
+                <w:sz w:val="18"/>
                 <w:szCs w:val="20"/>
               </w:rPr>
               <w:t xml:space="preserve">Role</w:t>
@@ -2958,7 +3534,7 @@
                 <w:b/>
                 <w:bCs/>
                 <w:color w:val="FFFFFF"/>
-                <w:sz w:val="20"/>
+                <w:sz w:val="18"/>
                 <w:szCs w:val="20"/>
               </w:rPr>
               <w:t xml:space="preserve">Core Capabilities</w:t>
@@ -2987,7 +3563,7 @@
                 <w:b w:val="false"/>
                 <w:bCs w:val="false"/>
                 <w:color w:val="1E293B"/>
-                <w:sz w:val="20"/>
+                <w:sz w:val="18"/>
                 <w:szCs w:val="20"/>
               </w:rPr>
               <w:t xml:space="preserve">Property Owner</w:t>
@@ -3014,7 +3590,7 @@
                 <w:b w:val="false"/>
                 <w:bCs w:val="false"/>
                 <w:color w:val="1E293B"/>
-                <w:sz w:val="20"/>
+                <w:sz w:val="18"/>
                 <w:szCs w:val="20"/>
               </w:rPr>
               <w:t xml:space="preserve">Create &amp; edit properties and units, upload photos, configure late fees, full portfolio reporting</w:t>
@@ -3043,7 +3619,7 @@
                 <w:b w:val="false"/>
                 <w:bCs w:val="false"/>
                 <w:color w:val="1E293B"/>
-                <w:sz w:val="20"/>
+                <w:sz w:val="18"/>
                 <w:szCs w:val="20"/>
               </w:rPr>
               <w:t xml:space="preserve">Property Manager</w:t>
@@ -3070,7 +3646,7 @@
                 <w:b w:val="false"/>
                 <w:bCs w:val="false"/>
                 <w:color w:val="1E293B"/>
-                <w:sz w:val="20"/>
+                <w:sz w:val="18"/>
                 <w:szCs w:val="20"/>
               </w:rPr>
               <w:t xml:space="preserve">Manage properties an Owner has added, onboard and blacklist tenants, assign and oversee maintenance work</w:t>
@@ -3099,7 +3675,7 @@
                 <w:b w:val="false"/>
                 <w:bCs w:val="false"/>
                 <w:color w:val="1E293B"/>
-                <w:sz w:val="20"/>
+                <w:sz w:val="18"/>
                 <w:szCs w:val="20"/>
               </w:rPr>
               <w:t xml:space="preserve">Tenant</w:t>
@@ -3126,7 +3702,7 @@
                 <w:b w:val="false"/>
                 <w:bCs w:val="false"/>
                 <w:color w:val="1E293B"/>
-                <w:sz w:val="20"/>
+                <w:sz w:val="18"/>
                 <w:szCs w:val="20"/>
               </w:rPr>
               <w:t xml:space="preserve">Self-service portal: view lease and balance, pay rent online, submit maintenance requests with photos, download statements</w:t>
@@ -3155,7 +3731,7 @@
                 <w:b w:val="false"/>
                 <w:bCs w:val="false"/>
                 <w:color w:val="1E293B"/>
-                <w:sz w:val="20"/>
+                <w:sz w:val="18"/>
                 <w:szCs w:val="20"/>
               </w:rPr>
               <w:t xml:space="preserve">Maintenance Staff</w:t>
@@ -3182,7 +3758,7 @@
                 <w:b w:val="false"/>
                 <w:bCs w:val="false"/>
                 <w:color w:val="1E293B"/>
-                <w:sz w:val="20"/>
+                <w:sz w:val="18"/>
                 <w:szCs w:val="20"/>
               </w:rPr>
               <w:t xml:space="preserve">A personal work queue only — assigned tickets, status updates, completion photos; no visibility into properties, tenants, or rent</w:t>
@@ -3211,7 +3787,7 @@
                 <w:b w:val="false"/>
                 <w:bCs w:val="false"/>
                 <w:color w:val="1E293B"/>
-                <w:sz w:val="20"/>
+                <w:sz w:val="18"/>
                 <w:szCs w:val="20"/>
               </w:rPr>
               <w:t xml:space="preserve">Administrator</w:t>
@@ -3238,7 +3814,7 @@
                 <w:b w:val="false"/>
                 <w:bCs w:val="false"/>
                 <w:color w:val="1E293B"/>
-                <w:sz w:val="20"/>
+                <w:sz w:val="18"/>
                 <w:szCs w:val="20"/>
               </w:rPr>
               <w:t xml:space="preserve">Full data visibility across the portfolio, plus a dedicated console for user and role management and staff account creation</w:t>
@@ -3257,7 +3833,7 @@
         <w:rPr>
           <w:b/>
           <w:bCs/>
-          <w:color w:val="2563EB"/>
+          <w:color w:val="0F172A"/>
           <w:sz w:val="26"/>
           <w:szCs w:val="26"/>
         </w:rPr>
@@ -3267,7 +3843,8 @@
     </w:p>
     <w:p>
       <w:pPr>
-        <w:spacing w:after="180" w:line="300"/>
+        <w:spacing w:after="180" w:line="276" w:lineRule="auto"/>
+        <w:jc w:val="both"/>
       </w:pPr>
       <w:r>
         <w:rPr>
@@ -3288,7 +3865,7 @@
         <w:rPr>
           <w:b/>
           <w:bCs/>
-          <w:color w:val="2563EB"/>
+          <w:color w:val="0F172A"/>
           <w:sz w:val="26"/>
           <w:szCs w:val="26"/>
         </w:rPr>
@@ -3298,7 +3875,8 @@
     </w:p>
     <w:p>
       <w:pPr>
-        <w:spacing w:after="180" w:line="300"/>
+        <w:spacing w:after="180" w:line="276" w:lineRule="auto"/>
+        <w:jc w:val="both"/>
       </w:pPr>
       <w:r>
         <w:rPr>
@@ -3319,7 +3897,7 @@
         <w:rPr>
           <w:b/>
           <w:bCs/>
-          <w:color w:val="2563EB"/>
+          <w:color w:val="0F172A"/>
           <w:sz w:val="26"/>
           <w:szCs w:val="26"/>
         </w:rPr>
@@ -3329,7 +3907,8 @@
     </w:p>
     <w:p>
       <w:pPr>
-        <w:spacing w:after="180" w:line="300"/>
+        <w:spacing w:after="180" w:line="276" w:lineRule="auto"/>
+        <w:jc w:val="both"/>
       </w:pPr>
       <w:r>
         <w:rPr>
@@ -3350,7 +3929,7 @@
         <w:rPr>
           <w:b/>
           <w:bCs/>
-          <w:color w:val="2563EB"/>
+          <w:color w:val="0F172A"/>
           <w:sz w:val="26"/>
           <w:szCs w:val="26"/>
         </w:rPr>
@@ -3360,7 +3939,8 @@
     </w:p>
     <w:p>
       <w:pPr>
-        <w:spacing w:after="180" w:line="300"/>
+        <w:spacing w:after="180" w:line="276" w:lineRule="auto"/>
+        <w:jc w:val="both"/>
       </w:pPr>
       <w:r>
         <w:rPr>
@@ -3391,7 +3971,8 @@
     </w:p>
     <w:p>
       <w:pPr>
-        <w:spacing w:after="180" w:line="300"/>
+        <w:spacing w:after="180" w:line="276" w:lineRule="auto"/>
+        <w:jc w:val="both"/>
       </w:pPr>
       <w:r>
         <w:rPr>
@@ -3442,7 +4023,7 @@
                 <w:b/>
                 <w:bCs/>
                 <w:color w:val="FFFFFF"/>
-                <w:sz w:val="20"/>
+                <w:sz w:val="18"/>
                 <w:szCs w:val="20"/>
               </w:rPr>
               <w:t xml:space="preserve">Metric</w:t>
@@ -3469,7 +4050,7 @@
                 <w:b/>
                 <w:bCs/>
                 <w:color w:val="FFFFFF"/>
-                <w:sz w:val="20"/>
+                <w:sz w:val="18"/>
                 <w:szCs w:val="20"/>
               </w:rPr>
               <w:t xml:space="preserve">Result</w:t>
@@ -3498,7 +4079,7 @@
                 <w:b w:val="false"/>
                 <w:bCs w:val="false"/>
                 <w:color w:val="1E293B"/>
-                <w:sz w:val="20"/>
+                <w:sz w:val="18"/>
                 <w:szCs w:val="20"/>
               </w:rPr>
               <w:t xml:space="preserve">Tests collected</w:t>
@@ -3525,7 +4106,7 @@
                 <w:b w:val="false"/>
                 <w:bCs w:val="false"/>
                 <w:color w:val="1E293B"/>
-                <w:sz w:val="20"/>
+                <w:sz w:val="18"/>
                 <w:szCs w:val="20"/>
               </w:rPr>
               <w:t>305</w:t>
@@ -3554,7 +4135,7 @@
                 <w:b w:val="false"/>
                 <w:bCs w:val="false"/>
                 <w:color w:val="1E293B"/>
-                <w:sz w:val="20"/>
+                <w:sz w:val="18"/>
                 <w:szCs w:val="20"/>
               </w:rPr>
               <w:t xml:space="preserve">Tests passed</w:t>
@@ -3581,7 +4162,7 @@
                 <w:b w:val="false"/>
                 <w:bCs w:val="false"/>
                 <w:color w:val="1E293B"/>
-                <w:sz w:val="20"/>
+                <w:sz w:val="18"/>
                 <w:szCs w:val="20"/>
               </w:rPr>
               <w:t>305</w:t>
@@ -3610,7 +4191,7 @@
                 <w:b w:val="false"/>
                 <w:bCs w:val="false"/>
                 <w:color w:val="1E293B"/>
-                <w:sz w:val="20"/>
+                <w:sz w:val="18"/>
                 <w:szCs w:val="20"/>
               </w:rPr>
               <w:t xml:space="preserve">Tests skipped</w:t>
@@ -3637,7 +4218,7 @@
                 <w:b w:val="false"/>
                 <w:bCs w:val="false"/>
                 <w:color w:val="1E293B"/>
-                <w:sz w:val="20"/>
+                <w:sz w:val="18"/>
                 <w:szCs w:val="20"/>
               </w:rPr>
               <w:t xml:space="preserve">0 on the latest run (one scheduler test self-skips on dates near month-end, where due-day clipping could shift the asserted date by a day)</w:t>
@@ -3666,7 +4247,7 @@
                 <w:b w:val="false"/>
                 <w:bCs w:val="false"/>
                 <w:color w:val="1E293B"/>
-                <w:sz w:val="20"/>
+                <w:sz w:val="18"/>
                 <w:szCs w:val="20"/>
               </w:rPr>
               <w:t xml:space="preserve">Tests failed</w:t>
@@ -3693,7 +4274,7 @@
                 <w:b w:val="false"/>
                 <w:bCs w:val="false"/>
                 <w:color w:val="1E293B"/>
-                <w:sz w:val="20"/>
+                <w:sz w:val="18"/>
                 <w:szCs w:val="20"/>
               </w:rPr>
               <w:t xml:space="preserve">0</w:t>
@@ -3722,7 +4303,7 @@
                 <w:b w:val="false"/>
                 <w:bCs w:val="false"/>
                 <w:color w:val="1E293B"/>
-                <w:sz w:val="20"/>
+                <w:sz w:val="18"/>
                 <w:szCs w:val="20"/>
               </w:rPr>
               <w:t xml:space="preserve">Statement coverage (pytest --cov=backend)</w:t>
@@ -3749,7 +4330,7 @@
                 <w:b w:val="false"/>
                 <w:bCs w:val="false"/>
                 <w:color w:val="1E293B"/>
-                <w:sz w:val="20"/>
+                <w:sz w:val="18"/>
                 <w:szCs w:val="20"/>
               </w:rPr>
               <w:t>86%</w:t>
@@ -3778,7 +4359,7 @@
                 <w:b w:val="false"/>
                 <w:bCs w:val="false"/>
                 <w:color w:val="1E293B"/>
-                <w:sz w:val="20"/>
+                <w:sz w:val="18"/>
                 <w:szCs w:val="20"/>
               </w:rPr>
               <w:t xml:space="preserve">Roles exercised by the auth test suite</w:t>
@@ -3805,7 +4386,7 @@
                 <w:b w:val="false"/>
                 <w:bCs w:val="false"/>
                 <w:color w:val="1E293B"/>
-                <w:sz w:val="20"/>
+                <w:sz w:val="18"/>
                 <w:szCs w:val="20"/>
               </w:rPr>
               <w:t xml:space="preserve">5 (Admin, Owner, Manager, Staff, Tenant)</w:t>
@@ -3834,7 +4415,7 @@
                 <w:b w:val="false"/>
                 <w:bCs w:val="false"/>
                 <w:color w:val="1E293B"/>
-                <w:sz w:val="20"/>
+                <w:sz w:val="18"/>
                 <w:szCs w:val="20"/>
               </w:rPr>
               <w:t xml:space="preserve">Use cases with at least one covering test</w:t>
@@ -3861,7 +4442,7 @@
                 <w:b w:val="false"/>
                 <w:bCs w:val="false"/>
                 <w:color w:val="1E293B"/>
-                <w:sz w:val="20"/>
+                <w:sz w:val="18"/>
                 <w:szCs w:val="20"/>
               </w:rPr>
               <w:t xml:space="preserve">25 / 25</w:t>
@@ -3880,7 +4461,7 @@
         <w:rPr>
           <w:b/>
           <w:bCs/>
-          <w:color w:val="2563EB"/>
+          <w:color w:val="0F172A"/>
           <w:sz w:val="26"/>
           <w:szCs w:val="26"/>
         </w:rPr>
@@ -4052,7 +4633,8 @@
     </w:p>
     <w:p>
       <w:pPr>
-        <w:spacing w:after="180" w:line="300"/>
+        <w:spacing w:after="180" w:line="276" w:lineRule="auto"/>
+        <w:jc w:val="both"/>
       </w:pPr>
       <w:r>
         <w:rPr>
@@ -4121,7 +4703,7 @@
                 <w:b/>
                 <w:bCs/>
                 <w:color w:val="FFFFFF"/>
-                <w:sz w:val="20"/>
+                <w:sz w:val="18"/>
                 <w:szCs w:val="20"/>
               </w:rPr>
               <w:t xml:space="preserve">Challenge</w:t>
@@ -4148,7 +4730,7 @@
                 <w:b/>
                 <w:bCs/>
                 <w:color w:val="FFFFFF"/>
-                <w:sz w:val="20"/>
+                <w:sz w:val="18"/>
                 <w:szCs w:val="20"/>
               </w:rPr>
               <w:t xml:space="preserve">How It Was Addressed</w:t>
@@ -4177,7 +4759,7 @@
                 <w:b w:val="false"/>
                 <w:bCs w:val="false"/>
                 <w:color w:val="1E293B"/>
-                <w:sz w:val="20"/>
+                <w:sz w:val="18"/>
                 <w:szCs w:val="20"/>
               </w:rPr>
               <w:t xml:space="preserve">Reconciling ambitious early design documents with what one developer could build and verify in the available time</w:t>
@@ -4204,7 +4786,7 @@
                 <w:b w:val="false"/>
                 <w:bCs w:val="false"/>
                 <w:color w:val="1E293B"/>
-                <w:sz w:val="20"/>
+                <w:sz w:val="18"/>
                 <w:szCs w:val="20"/>
               </w:rPr>
               <w:t xml:space="preserve">Simplified IT401 Deliverable 2’s microservice-style package diagram to a layered monolith (Section 4); when IT401 Deliverable 3’s originally-stated test and coverage numbers were found to be overstated, corrected the document to the real, verified numbers rather than leaving the discrepancy in place</w:t>
@@ -4233,7 +4815,7 @@
                 <w:b w:val="false"/>
                 <w:bCs w:val="false"/>
                 <w:color w:val="1E293B"/>
-                <w:sz w:val="20"/>
+                <w:sz w:val="18"/>
                 <w:szCs w:val="20"/>
               </w:rPr>
               <w:t xml:space="preserve">Getting recurring, calendar-based billing correct at month boundaries (a lease starting on the 31st, a due day that doesn’t exist in February)</w:t>
@@ -4260,7 +4842,7 @@
                 <w:b w:val="false"/>
                 <w:bCs w:val="false"/>
                 <w:color w:val="1E293B"/>
-                <w:sz w:val="20"/>
+                <w:sz w:val="18"/>
                 <w:szCs w:val="20"/>
               </w:rPr>
               <w:t xml:space="preserve">Wrote the edge-case tests before trusting the implementation, catching clipping errors that would otherwise have shifted a due date by a day</w:t>
@@ -4289,7 +4871,7 @@
                 <w:b w:val="false"/>
                 <w:bCs w:val="false"/>
                 <w:color w:val="1E293B"/>
-                <w:sz w:val="20"/>
+                <w:sz w:val="18"/>
                 <w:szCs w:val="20"/>
               </w:rPr>
               <w:t xml:space="preserve">Keeping the whole system — including payments and notifications — testable without any live external account</w:t>
@@ -4316,7 +4898,7 @@
                 <w:b w:val="false"/>
                 <w:bCs w:val="false"/>
                 <w:color w:val="1E293B"/>
-                <w:sz w:val="20"/>
+                <w:sz w:val="18"/>
                 <w:szCs w:val="20"/>
               </w:rPr>
               <w:t xml:space="preserve">Built a dev-mode fallback pattern into every external service integration (SendGrid, Twilio, Stripe), which is also what lets the demo video and this whole project run fully offline</w:t>
@@ -4345,7 +4927,7 @@
                 <w:b w:val="false"/>
                 <w:bCs w:val="false"/>
                 <w:color w:val="1E293B"/>
-                <w:sz w:val="20"/>
+                <w:sz w:val="18"/>
                 <w:szCs w:val="20"/>
               </w:rPr>
               <w:t xml:space="preserve">Keeping documentation honest as the system evolved past its initial prototype</w:t>
@@ -4372,7 +4954,7 @@
                 <w:b w:val="false"/>
                 <w:bCs w:val="false"/>
                 <w:color w:val="1E293B"/>
-                <w:sz w:val="20"/>
+                <w:sz w:val="18"/>
                 <w:szCs w:val="20"/>
               </w:rPr>
               <w:t>Every figure is produced by running the code. IT401 Deliverable 3 stands exactly as submitted; IT402 Deliverable 1 keeps the figures of its own build in its main chapters, with one clearly marked closing appendix on later changes; and later reports describe each change in its own section, so no report mixes two points in time</w:t>
@@ -4401,7 +4983,7 @@
                 <w:b w:val="false"/>
                 <w:bCs w:val="false"/>
                 <w:color w:val="1E293B"/>
-                <w:sz w:val="20"/>
+                <w:sz w:val="18"/>
                 <w:szCs w:val="20"/>
               </w:rPr>
               <w:t xml:space="preserve">Extending a fully-tested, shipped system with eight major billing features without breaking any of it</w:t>
@@ -4428,7 +5010,7 @@
                 <w:b w:val="false"/>
                 <w:bCs w:val="false"/>
                 <w:color w:val="1E293B"/>
-                <w:sz w:val="20"/>
+                <w:sz w:val="18"/>
                 <w:szCs w:val="20"/>
               </w:rPr>
               <w:t xml:space="preserve">Every new capability (charges, metering, pro rata, revisions, auto billing, statements, receipts, expenses) was designed additively — new tables and nullable/defaulted fields only, so an existing lease with none of them set behaves exactly as it did before — and the full pre-existing suite was re-run after every single change to confirm zero regressions before moving to the next</w:t>
@@ -4457,7 +5039,7 @@
                 <w:b w:val="false"/>
                 <w:bCs w:val="false"/>
                 <w:color w:val="1E293B"/>
-                <w:sz w:val="20"/>
+                <w:sz w:val="18"/>
                 <w:szCs w:val="20"/>
               </w:rPr>
               <w:t xml:space="preserve">Adding two more languages late in the project — one of them written right to left — without a translation library and without translating the data by mistake</w:t>
@@ -4484,7 +5066,7 @@
                 <w:b w:val="false"/>
                 <w:bCs w:val="false"/>
                 <w:color w:val="1E293B"/>
-                <w:sz w:val="20"/>
+                <w:sz w:val="18"/>
                 <w:szCs w:val="20"/>
               </w:rPr>
               <w:t xml:space="preserve">Wrapped only interface text in a small _() helper with an English fallback, so the app works at every stage of translation; switched Arabic pages to right to left and aligned text to the start of the line so one stylesheet serves both directions; kept names and places as plain data, and added a test that fails if a Harare place name is ever changed or given a Shona or Arabic entry</w:t>
@@ -4513,7 +5095,7 @@
                 <w:b w:val="false"/>
                 <w:bCs w:val="false"/>
                 <w:color w:val="1E293B"/>
-                <w:sz w:val="20"/>
+                <w:sz w:val="18"/>
                 <w:szCs w:val="20"/>
               </w:rPr>
               <w:t>Right-to-left Arabic in PDFs, where the PDF library draws text exactly as given</w:t>
@@ -4540,7 +5122,7 @@
                 <w:b w:val="false"/>
                 <w:bCs w:val="false"/>
                 <w:color w:val="1E293B"/>
-                <w:sz w:val="20"/>
+                <w:sz w:val="18"/>
                 <w:szCs w:val="20"/>
               </w:rPr>
               <w:t>Joined the letters with arabic-reshaper and reordered each line with python-bidi, wrapping long lines before reordering so paragraphs still read top to bottom; isolated dates, codes and amounts so they keep their order; mirrored brackets by hand after finding the bidi library reorders text without mirroring them; and checked the rendered pages visually, not just by test</w:t>
@@ -4551,7 +5133,8 @@
     </w:tbl>
     <w:p>
       <w:pPr>
-        <w:spacing w:after="180" w:line="300"/>
+        <w:spacing w:after="180" w:line="276" w:lineRule="auto"/>
+        <w:jc w:val="both"/>
       </w:pPr>
       <w:r>
         <w:rPr>
@@ -4582,7 +5165,8 @@
     </w:p>
     <w:p>
       <w:pPr>
-        <w:spacing w:after="180" w:line="300"/>
+        <w:spacing w:after="180" w:line="276" w:lineRule="auto"/>
+        <w:jc w:val="both"/>
       </w:pPr>
       <w:r>
         <w:rPr>
@@ -4603,7 +5187,7 @@
         <w:rPr>
           <w:b/>
           <w:bCs/>
-          <w:color w:val="2563EB"/>
+          <w:color w:val="0F172A"/>
           <w:sz w:val="26"/>
           <w:szCs w:val="26"/>
         </w:rPr>
@@ -4729,7 +5313,8 @@
     </w:p>
     <w:p>
       <w:pPr>
-        <w:spacing w:after="180" w:line="300"/>
+        <w:spacing w:after="180" w:line="276" w:lineRule="auto"/>
+        <w:jc w:val="both"/>
       </w:pPr>
       <w:r>
         <w:rPr>
@@ -4803,7 +5388,7 @@
                 <w:b/>
                 <w:bCs/>
                 <w:color w:val="FFFFFF"/>
-                <w:sz w:val="20"/>
+                <w:sz w:val="18"/>
                 <w:szCs w:val="20"/>
               </w:rPr>
               <w:t xml:space="preserve">Statistic</w:t>
@@ -4830,7 +5415,7 @@
                 <w:b/>
                 <w:bCs/>
                 <w:color w:val="FFFFFF"/>
-                <w:sz w:val="20"/>
+                <w:sz w:val="18"/>
                 <w:szCs w:val="20"/>
               </w:rPr>
               <w:t xml:space="preserve">Value</w:t>
@@ -4859,7 +5444,7 @@
                 <w:b w:val="false"/>
                 <w:bCs w:val="false"/>
                 <w:color w:val="1E293B"/>
-                <w:sz w:val="20"/>
+                <w:sz w:val="18"/>
                 <w:szCs w:val="20"/>
               </w:rPr>
               <w:t xml:space="preserve">Use cases (SRS)</w:t>
@@ -4886,7 +5471,7 @@
                 <w:b w:val="false"/>
                 <w:bCs w:val="false"/>
                 <w:color w:val="1E293B"/>
-                <w:sz w:val="20"/>
+                <w:sz w:val="18"/>
                 <w:szCs w:val="20"/>
               </w:rPr>
               <w:t xml:space="preserve">25</w:t>
@@ -4915,7 +5500,7 @@
                 <w:b w:val="false"/>
                 <w:bCs w:val="false"/>
                 <w:color w:val="1E293B"/>
-                <w:sz w:val="20"/>
+                <w:sz w:val="18"/>
                 <w:szCs w:val="20"/>
               </w:rPr>
               <w:t xml:space="preserve">Database tables</w:t>
@@ -4942,7 +5527,7 @@
                 <w:b w:val="false"/>
                 <w:bCs w:val="false"/>
                 <w:color w:val="1E293B"/>
-                <w:sz w:val="20"/>
+                <w:sz w:val="18"/>
                 <w:szCs w:val="20"/>
               </w:rPr>
               <w:t xml:space="preserve">18 (13 original + 5 for the billing engine)</w:t>
@@ -4971,7 +5556,7 @@
                 <w:b w:val="false"/>
                 <w:bCs w:val="false"/>
                 <w:color w:val="1E293B"/>
-                <w:sz w:val="20"/>
+                <w:sz w:val="18"/>
                 <w:szCs w:val="20"/>
               </w:rPr>
               <w:t xml:space="preserve">Route blueprints</w:t>
@@ -4998,7 +5583,7 @@
                 <w:b w:val="false"/>
                 <w:bCs w:val="false"/>
                 <w:color w:val="1E293B"/>
-                <w:sz w:val="20"/>
+                <w:sz w:val="18"/>
                 <w:szCs w:val="20"/>
               </w:rPr>
               <w:t xml:space="preserve">10</w:t>
@@ -5027,7 +5612,7 @@
                 <w:b w:val="false"/>
                 <w:bCs w:val="false"/>
                 <w:color w:val="1E293B"/>
-                <w:sz w:val="20"/>
+                <w:sz w:val="18"/>
                 <w:szCs w:val="20"/>
               </w:rPr>
               <w:t xml:space="preserve">User roles</w:t>
@@ -5054,7 +5639,7 @@
                 <w:b w:val="false"/>
                 <w:bCs w:val="false"/>
                 <w:color w:val="1E293B"/>
-                <w:sz w:val="20"/>
+                <w:sz w:val="18"/>
                 <w:szCs w:val="20"/>
               </w:rPr>
               <w:t xml:space="preserve">5</w:t>
@@ -5083,7 +5668,7 @@
                 <w:b w:val="false"/>
                 <w:bCs w:val="false"/>
                 <w:color w:val="1E293B"/>
-                <w:sz w:val="20"/>
+                <w:sz w:val="18"/>
                 <w:szCs w:val="20"/>
               </w:rPr>
               <w:t xml:space="preserve">Jinja2 templates</w:t>
@@ -5110,7 +5695,7 @@
                 <w:b w:val="false"/>
                 <w:bCs w:val="false"/>
                 <w:color w:val="1E293B"/>
-                <w:sz w:val="20"/>
+                <w:sz w:val="18"/>
                 <w:szCs w:val="20"/>
               </w:rPr>
               <w:t>40</w:t>
@@ -5139,7 +5724,7 @@
                 <w:b w:val="false"/>
                 <w:bCs w:val="false"/>
                 <w:color w:val="1E293B"/>
-                <w:sz w:val="20"/>
+                <w:sz w:val="18"/>
                 <w:szCs w:val="20"/>
               </w:rPr>
               <w:t xml:space="preserve">Background scheduler jobs</w:t>
@@ -5166,7 +5751,7 @@
                 <w:b w:val="false"/>
                 <w:bCs w:val="false"/>
                 <w:color w:val="1E293B"/>
-                <w:sz w:val="20"/>
+                <w:sz w:val="18"/>
                 <w:szCs w:val="20"/>
               </w:rPr>
               <w:t xml:space="preserve">5</w:t>
@@ -5195,7 +5780,7 @@
                 <w:b w:val="false"/>
                 <w:bCs w:val="false"/>
                 <w:color w:val="1E293B"/>
-                <w:sz w:val="20"/>
+                <w:sz w:val="18"/>
                 <w:szCs w:val="20"/>
               </w:rPr>
               <w:t xml:space="preserve">Automated tests</w:t>
@@ -5222,7 +5807,7 @@
                 <w:b w:val="false"/>
                 <w:bCs w:val="false"/>
                 <w:color w:val="1E293B"/>
-                <w:sz w:val="20"/>
+                <w:sz w:val="18"/>
                 <w:szCs w:val="20"/>
               </w:rPr>
               <w:t>305</w:t>
@@ -5251,7 +5836,7 @@
                 <w:b w:val="false"/>
                 <w:bCs w:val="false"/>
                 <w:color w:val="1E293B"/>
-                <w:sz w:val="20"/>
+                <w:sz w:val="18"/>
                 <w:szCs w:val="20"/>
               </w:rPr>
               <w:t xml:space="preserve">Tests passing</w:t>
@@ -5278,7 +5863,7 @@
                 <w:b w:val="false"/>
                 <w:bCs w:val="false"/>
                 <w:color w:val="1E293B"/>
-                <w:sz w:val="20"/>
+                <w:sz w:val="18"/>
                 <w:szCs w:val="20"/>
               </w:rPr>
               <w:t>305</w:t>
@@ -5307,7 +5892,7 @@
                 <w:b w:val="false"/>
                 <w:bCs w:val="false"/>
                 <w:color w:val="1E293B"/>
-                <w:sz w:val="20"/>
+                <w:sz w:val="18"/>
                 <w:szCs w:val="20"/>
               </w:rPr>
               <w:t xml:space="preserve">Tests skipped</w:t>
@@ -5334,7 +5919,7 @@
                 <w:b w:val="false"/>
                 <w:bCs w:val="false"/>
                 <w:color w:val="1E293B"/>
-                <w:sz w:val="20"/>
+                <w:sz w:val="18"/>
                 <w:szCs w:val="20"/>
               </w:rPr>
               <w:t xml:space="preserve">0</w:t>
@@ -5363,7 +5948,7 @@
                 <w:b w:val="false"/>
                 <w:bCs w:val="false"/>
                 <w:color w:val="1E293B"/>
-                <w:sz w:val="20"/>
+                <w:sz w:val="18"/>
                 <w:szCs w:val="20"/>
               </w:rPr>
               <w:t xml:space="preserve">Test failures</w:t>
@@ -5390,7 +5975,7 @@
                 <w:b w:val="false"/>
                 <w:bCs w:val="false"/>
                 <w:color w:val="1E293B"/>
-                <w:sz w:val="20"/>
+                <w:sz w:val="18"/>
                 <w:szCs w:val="20"/>
               </w:rPr>
               <w:t xml:space="preserve">0</w:t>
@@ -5419,7 +6004,7 @@
                 <w:b w:val="false"/>
                 <w:bCs w:val="false"/>
                 <w:color w:val="1E293B"/>
-                <w:sz w:val="20"/>
+                <w:sz w:val="18"/>
                 <w:szCs w:val="20"/>
               </w:rPr>
               <w:t xml:space="preserve">Statement coverage</w:t>
@@ -5446,7 +6031,7 @@
                 <w:b w:val="false"/>
                 <w:bCs w:val="false"/>
                 <w:color w:val="1E293B"/>
-                <w:sz w:val="20"/>
+                <w:sz w:val="18"/>
                 <w:szCs w:val="20"/>
               </w:rPr>
               <w:t>86%</w:t>
@@ -5475,7 +6060,7 @@
                 <w:b w:val="false"/>
                 <w:bCs w:val="false"/>
                 <w:color w:val="1E293B"/>
-                <w:sz w:val="20"/>
+                <w:sz w:val="18"/>
                 <w:szCs w:val="20"/>
               </w:rPr>
               <w:t xml:space="preserve">IT402 Deliverable 2 feature gaps closed</w:t>
@@ -5502,7 +6087,7 @@
                 <w:b w:val="false"/>
                 <w:bCs w:val="false"/>
                 <w:color w:val="1E293B"/>
-                <w:sz w:val="20"/>
+                <w:sz w:val="18"/>
                 <w:szCs w:val="20"/>
               </w:rPr>
               <w:t>11</w:t>
@@ -5531,7 +6116,7 @@
                 <w:b w:val="false"/>
                 <w:bCs w:val="false"/>
                 <w:color w:val="1E293B"/>
-                <w:sz w:val="20"/>
+                <w:sz w:val="18"/>
                 <w:szCs w:val="20"/>
               </w:rPr>
               <w:t xml:space="preserve">IT402 Deliverable 2 dedicated tests</w:t>
@@ -5558,7 +6143,7 @@
                 <w:b w:val="false"/>
                 <w:bCs w:val="false"/>
                 <w:color w:val="1E293B"/>
-                <w:sz w:val="20"/>
+                <w:sz w:val="18"/>
                 <w:szCs w:val="20"/>
               </w:rPr>
               <w:t xml:space="preserve">31</w:t>
@@ -5587,7 +6172,7 @@
                 <w:b w:val="false"/>
                 <w:bCs w:val="false"/>
                 <w:color w:val="1E293B"/>
-                <w:sz w:val="20"/>
+                <w:sz w:val="18"/>
                 <w:szCs w:val="20"/>
               </w:rPr>
               <w:t xml:space="preserve">Billing engine features added</w:t>
@@ -5614,7 +6199,7 @@
                 <w:b w:val="false"/>
                 <w:bCs w:val="false"/>
                 <w:color w:val="1E293B"/>
-                <w:sz w:val="20"/>
+                <w:sz w:val="18"/>
                 <w:szCs w:val="20"/>
               </w:rPr>
               <w:t xml:space="preserve">8</w:t>
@@ -5643,7 +6228,7 @@
                 <w:b w:val="false"/>
                 <w:bCs w:val="false"/>
                 <w:color w:val="1E293B"/>
-                <w:sz w:val="20"/>
+                <w:sz w:val="18"/>
                 <w:szCs w:val="20"/>
               </w:rPr>
               <w:t xml:space="preserve">Billing engine dedicated tests</w:t>
@@ -5670,7 +6255,7 @@
                 <w:b w:val="false"/>
                 <w:bCs w:val="false"/>
                 <w:color w:val="1E293B"/>
-                <w:sz w:val="20"/>
+                <w:sz w:val="18"/>
                 <w:szCs w:val="20"/>
               </w:rPr>
               <w:t xml:space="preserve">79</w:t>
@@ -5699,7 +6284,7 @@
                 <w:b w:val="false"/>
                 <w:bCs w:val="false"/>
                 <w:color w:val="1E293B"/>
-                <w:sz w:val="20"/>
+                <w:sz w:val="18"/>
                 <w:szCs w:val="20"/>
               </w:rPr>
               <w:t xml:space="preserve">Usability &amp; localisation dedicated tests</w:t>
@@ -5726,7 +6311,7 @@
                 <w:b w:val="false"/>
                 <w:bCs w:val="false"/>
                 <w:color w:val="1E293B"/>
-                <w:sz w:val="20"/>
+                <w:sz w:val="18"/>
                 <w:szCs w:val="20"/>
               </w:rPr>
               <w:t xml:space="preserve">27</w:t>
@@ -5755,7 +6340,7 @@
                 <w:b w:val="false"/>
                 <w:bCs w:val="false"/>
                 <w:color w:val="1E293B"/>
-                <w:sz w:val="20"/>
+                <w:sz w:val="18"/>
                 <w:szCs w:val="20"/>
               </w:rPr>
               <w:t xml:space="preserve">Tenant history &amp; maintenance summary tests</w:t>
@@ -5782,7 +6367,7 @@
                 <w:b w:val="false"/>
                 <w:bCs w:val="false"/>
                 <w:color w:val="1E293B"/>
-                <w:sz w:val="20"/>
+                <w:sz w:val="18"/>
                 <w:szCs w:val="20"/>
               </w:rPr>
               <w:t xml:space="preserve">13</w:t>
@@ -5811,7 +6396,7 @@
                 <w:b w:val="false"/>
                 <w:bCs w:val="false"/>
                 <w:color w:val="1E293B"/>
-                <w:sz w:val="20"/>
+                <w:sz w:val="18"/>
                 <w:szCs w:val="20"/>
               </w:rPr>
               <w:t>Full Arabic &amp; hardening dedicated tests</w:t>
@@ -5838,7 +6423,7 @@
                 <w:b w:val="false"/>
                 <w:bCs w:val="false"/>
                 <w:color w:val="1E293B"/>
-                <w:sz w:val="20"/>
+                <w:sz w:val="18"/>
                 <w:szCs w:val="20"/>
               </w:rPr>
               <w:t>54</w:t>
@@ -5867,7 +6452,7 @@
                 <w:b w:val="false"/>
                 <w:bCs w:val="false"/>
                 <w:color w:val="1E293B"/>
-                <w:sz w:val="20"/>
+                <w:sz w:val="18"/>
                 <w:szCs w:val="20"/>
               </w:rPr>
               <w:t>Render deployment dedicated tests</w:t>
@@ -5894,7 +6479,7 @@
                 <w:b w:val="false"/>
                 <w:bCs w:val="false"/>
                 <w:color w:val="1E293B"/>
-                <w:sz w:val="20"/>
+                <w:sz w:val="18"/>
                 <w:szCs w:val="20"/>
               </w:rPr>
               <w:t>7</w:t>
@@ -5923,7 +6508,7 @@
                 <w:b w:val="false"/>
                 <w:bCs w:val="false"/>
                 <w:color w:val="1E293B"/>
-                <w:sz w:val="20"/>
+                <w:sz w:val="18"/>
                 <w:szCs w:val="20"/>
               </w:rPr>
               <w:t xml:space="preserve">SRS functional requirements met</w:t>
@@ -5950,7 +6535,7 @@
                 <w:b w:val="false"/>
                 <w:bCs w:val="false"/>
                 <w:color w:val="1E293B"/>
-                <w:sz w:val="20"/>
+                <w:sz w:val="18"/>
                 <w:szCs w:val="20"/>
               </w:rPr>
               <w:t xml:space="preserve">44 / 44 (FR-021 and FR-044 by design in a different way)</w:t>
@@ -5979,7 +6564,7 @@
                 <w:b w:val="false"/>
                 <w:bCs w:val="false"/>
                 <w:color w:val="1E293B"/>
-                <w:sz w:val="20"/>
+                <w:sz w:val="18"/>
                 <w:szCs w:val="20"/>
               </w:rPr>
               <w:t xml:space="preserve">Interface languages</w:t>
@@ -6006,7 +6591,7 @@
                 <w:b w:val="false"/>
                 <w:bCs w:val="false"/>
                 <w:color w:val="1E293B"/>
-                <w:sz w:val="20"/>
+                <w:sz w:val="18"/>
                 <w:szCs w:val="20"/>
               </w:rPr>
               <w:t>3 (English, Shona, Arabic — Arabic across every screen, message and document)</w:t>
@@ -6035,7 +6620,7 @@
                 <w:b w:val="false"/>
                 <w:bCs w:val="false"/>
                 <w:color w:val="1E293B"/>
-                <w:sz w:val="20"/>
+                <w:sz w:val="18"/>
                 <w:szCs w:val="20"/>
               </w:rPr>
               <w:t xml:space="preserve">Demo portfolio</w:t>
@@ -6062,7 +6647,7 @@
                 <w:b w:val="false"/>
                 <w:bCs w:val="false"/>
                 <w:color w:val="1E293B"/>
-                <w:sz w:val="20"/>
+                <w:sz w:val="18"/>
                 <w:szCs w:val="20"/>
               </w:rPr>
               <w:t xml:space="preserve">5 Harare properties, 16 units, 9 tenants</w:t>
@@ -6091,7 +6676,7 @@
                 <w:b w:val="false"/>
                 <w:bCs w:val="false"/>
                 <w:color w:val="1E293B"/>
-                <w:sz w:val="20"/>
+                <w:sz w:val="18"/>
                 <w:szCs w:val="20"/>
               </w:rPr>
               <w:t xml:space="preserve">Deployment</w:t>
@@ -6118,7 +6703,7 @@
                 <w:b w:val="false"/>
                 <w:bCs w:val="false"/>
                 <w:color w:val="1E293B"/>
-                <w:sz w:val="20"/>
+                <w:sz w:val="18"/>
                 <w:szCs w:val="20"/>
               </w:rPr>
               <w:t>Docker Compose (Flask/Gunicorn + PostgreSQL + Redis), GitHub Actions CI, Alembic migrations, optional S3 file storage, Render (render.yaml)</w:t>
@@ -6194,7 +6779,7 @@
         <w:sz w:val="16"/>
         <w:szCs w:val="16"/>
       </w:rPr>
-      <w:t xml:space="preserve">RentalPro — Final Capstone Project Report   |   Page </w:t>
+      <w:t xml:space="preserve">RentalPro — IT402 Deliverable 3 — Final Capstone Project Report   |   Page </w:t>
     </w:r>
     <w:r>
       <w:rPr>

</xml_diff>